<commit_message>
Restore mandatory bootcamp, simplify setup validation, and render unit projects in notes packets with relative vocabulary visuals
</commit_message>
<xml_diff>
--- a/lessons/2-4/downloads/2-4-notes.docx
+++ b/lessons/2-4/downloads/2-4-notes.docx
@@ -373,7 +373,7 @@
                 <w:sz w:val="21"/>
                 <w:szCs w:val="21"/>
               </w:rPr>
-              <w:t xml:space="preserve">A whole number plus a fraction, like 2 1/2.</w:t>
+              <w:t xml:space="preserve">A whole number plus a fraction, like 2 1/3.</w:t>
             </w:r>
           </w:p>
           <w:p>
@@ -2736,7 +2736,7 @@
                 <w:sz w:val="20"/>
                 <w:szCs w:val="20"/>
               </w:rPr>
-              <w:t xml:space="preserve">Mixed Number is a whole number plus a fraction, like 2 1/2.</w:t>
+              <w:t xml:space="preserve">Mixed Number is a whole number plus a fraction, like 2 1/3.</w:t>
             </w:r>
           </w:p>
         </w:tc>
@@ -3509,7 +3509,7 @@
           <w:sz w:val="20"/>
           <w:szCs w:val="20"/>
         </w:rPr>
-        <w:t xml:space="preserve">Kernel sentence: a complete sentence needs a subject and a verb. Example: Mixed Number is a whole number plus a fraction, like 2 1/2.</w:t>
+        <w:t xml:space="preserve">Kernel sentence: a complete sentence needs a subject and a verb. Example: Mixed Number is a whole number plus a fraction, like 2 1/3.</w:t>
       </w:r>
     </w:p>
     <w:p>

</xml_diff>